<commit_message>
STEP 11 ASTRA W11-05: add detailed planning DOCX authority
</commit_message>
<xml_diff>
--- a/docs/source-of-truth/planning/current/10_STEP_11_FEATURE_REGISTRY_DEPENDENCY_GRAPH_WAVE_01_CHARTER_LAGU_FULL_ALBUM_v1_0.docx
+++ b/docs/source-of-truth/planning/current/10_STEP_11_FEATURE_REGISTRY_DEPENDENCY_GRAPH_WAVE_01_CHARTER_LAGU_FULL_ALBUM_v1_0.docx
@@ -89,12 +89,12 @@
     </w:p>
     <w:p>
       <w:r>
-        <w:t>Status: NORMALIZED / W11-01 COMPLETE; W11-02 COMPLETE; W11-03 COMPLETE / PASS; W11-04 PLANNING COMPLETE / PASS</w:t>
+        <w:t>Status: NORMALIZED / W11-01..04 COMPLETE / PASS; W11-05 PLANNING COMPLETE / PASS</w:t>
       </w:r>
     </w:p>
     <w:p>
       <w:r>
-        <w:t>Implementation status: W11-01 COMPLETE / PASS; W11-02 COMPLETE / PASS; W11-03 COMPLETE / PASS; W11-04 COMPLETE / PASS</w:t>
+        <w:t>Implementation status: W11-01..04 COMPLETE / PASS; W11-05 NOT STARTED — T11-W05-01 READY after planning merge</w:t>
       </w:r>
     </w:p>
     <w:p>
@@ -685,7 +685,7 @@
           </w:tcPr>
           <w:p>
             <w:r>
-              <w:t>PLANNED W11-05</w:t>
+              <w:t>W11-05 PLANNING PASS / T11-W05-01 READY AFTER MERGE</w:t>
             </w:r>
           </w:p>
         </w:tc>
@@ -957,7 +957,7 @@
           </w:tcPr>
           <w:p>
             <w:r>
-              <w:t>PLANNED W11-05</w:t>
+              <w:t>W11-05 PLANNING PASS / SERIAL BLOCKED BEHIND T11-W05-01..02</w:t>
             </w:r>
           </w:p>
         </w:tc>
@@ -1433,7 +1433,7 @@
           </w:tcPr>
           <w:p>
             <w:r>
-              <w:t>W11-01 PASS / W11-02 PASS / W11-03 PASS / W11-04 PASS CROSS-CUT</w:t>
+              <w:t>W11-01..04 PASS; W11-05 PLANNED CROSS-CUT</w:t>
             </w:r>
           </w:p>
         </w:tc>
@@ -2336,7 +2336,103 @@
         <w:pStyle w:val="ListBullet"/>
       </w:pPr>
       <w:r>
-        <w:t>W11-05 FTR-007 + FTR-011 is dependency-unlocked for ASTRA planning only.</w:t>
+        <w:t>W11-05 FTR-007 + FTR-011 ASTRA planning is COMPLETE / PASS; implementation has not started.</w:t>
+      </w:r>
+    </w:p>
+    <w:p>
+      <w:pPr>
+        <w:pStyle w:val="Heading2"/>
+      </w:pPr>
+      <w:r>
+        <w:t>W11-05 planning checkpoint</w:t>
+      </w:r>
+    </w:p>
+    <w:p>
+      <w:pPr>
+        <w:pStyle w:val="ListBullet"/>
+      </w:pPr>
+      <w:r>
+        <w:t>Baseline: `main@8f145a6684177286f8bae3bb9c50515d6f5703b7`.</w:t>
+      </w:r>
+    </w:p>
+    <w:p>
+      <w:pPr>
+        <w:pStyle w:val="ListBullet"/>
+      </w:pPr>
+      <w:r>
+        <w:t>Features: FTR-007 + FTR-011 with FTR-013/FTR-018 cross-cut.</w:t>
+      </w:r>
+    </w:p>
+    <w:p>
+      <w:pPr>
+        <w:pStyle w:val="ListBullet"/>
+      </w:pPr>
+      <w:r>
+        <w:t>ASTRA planning: COMPLETE / PASS.</w:t>
+      </w:r>
+    </w:p>
+    <w:p>
+      <w:pPr>
+        <w:pStyle w:val="ListBullet"/>
+      </w:pPr>
+      <w:r>
+        <w:t>DoR: PASS.</w:t>
+      </w:r>
+    </w:p>
+    <w:p>
+      <w:pPr>
+        <w:pStyle w:val="ListBullet"/>
+      </w:pPr>
+      <w:r>
+        <w:t>Acceptance: AC-W11-05-01..25.</w:t>
+      </w:r>
+    </w:p>
+    <w:p>
+      <w:pPr>
+        <w:pStyle w:val="ListBullet"/>
+      </w:pPr>
+      <w:r>
+        <w:t>Planning authority: `docs/source-of-truth/planning/current/14_STEP_11_W11_05_MANUAL_LAYER_EDITOR_TEMPLATES_CHARTER_LAGU_FULL_ALBUM_v1_0.docx`, `WAVE_11_05_CHARTER.md`, `TASK_CARDS_W11_05.md`, `W11_05_ACCEPTANCE_MATRIX.md`, `W11_05_DOR.md`.</w:t>
+      </w:r>
+    </w:p>
+    <w:p>
+      <w:pPr>
+        <w:pStyle w:val="ListBullet"/>
+      </w:pPr>
+      <w:r>
+        <w:t>Frozen UI authority: SCR-002C + SCR-003A + SCR-003B + DLG-008/UI-IMG-012. No new prompt/image stage is required.</w:t>
+      </w:r>
+    </w:p>
+    <w:p>
+      <w:pPr>
+        <w:pStyle w:val="ListBullet"/>
+      </w:pPr>
+      <w:r>
+        <w:t>Manual Layer Editor is primary; template workflow is visual-only/non-destructive and uses the same Project State + CommandEngine.</w:t>
+      </w:r>
+    </w:p>
+    <w:p>
+      <w:pPr>
+        <w:pStyle w:val="ListBullet"/>
+      </w:pPr>
+      <w:r>
+        <w:t>W11-05 boundary: static visual scene/layer state and local templates only. W11-06 keeps playback/audio-reactive; W11-07 keeps keyframe/transition execution; STEP 12 keeps Gemini/FFmpeg.</w:t>
+      </w:r>
+    </w:p>
+    <w:p>
+      <w:pPr>
+        <w:pStyle w:val="ListBullet"/>
+      </w:pPr>
+      <w:r>
+        <w:t>Serial task gate: T11-W05-01 READY after planning merge; T11-W05-02..07 BLOCKED.</w:t>
+      </w:r>
+    </w:p>
+    <w:p>
+      <w:pPr>
+        <w:pStyle w:val="ListBullet"/>
+      </w:pPr>
+      <w:r>
+        <w:t>FTR-007/FTR-011 are **not VERIFIED** until implementation + W11-05 closure evidence passes.</w:t>
       </w:r>
     </w:p>
     <w:p>
@@ -2455,7 +2551,7 @@
         <w:pStyle w:val="ListNumber"/>
       </w:pPr>
       <w:r>
-        <w:t>**W11-05 — Manual Layer Editor + Templates** — FTR-007 + FTR-011 + FTR-013</w:t>
+        <w:t>**W11-05 — Manual Layer Editor + Templates** — FTR-007 + FTR-011 + FTR-013 — **PLANNING COMPLETE / PASS; T11-W05-01 READY AFTER MERGE**</w:t>
       </w:r>
     </w:p>
     <w:p>
@@ -3262,7 +3358,7 @@
         <w:pStyle w:val="ListBullet"/>
       </w:pPr>
       <w:r>
-        <w:t>W11-05 is dependency-unlocked for **ASTRA planning only**; implementation remains blocked until its own planning/DoR gate passes.</w:t>
+        <w:t>W11-05 ASTRA planning/DoR is COMPLETE / PASS; T11-W05-01 is ready after planning merge and later W11-05 tasks remain serially blocked.</w:t>
       </w:r>
     </w:p>
     <w:p>
@@ -3430,7 +3526,7 @@
         <w:pStyle w:val="ListBullet"/>
       </w:pPr>
       <w:r>
-        <w:t>Dependency unlock: W11-05 ASTRA planning only.</w:t>
+        <w:t>Dependency unlock: W11-05 planning PASS; T11-W05-01 READY after planning merge.</w:t>
       </w:r>
     </w:p>
     <w:p>
@@ -3502,7 +3598,103 @@
         <w:pStyle w:val="ListBullet"/>
       </w:pPr>
       <w:r>
-        <w:t>Dependency unlock: W11-05 Manual Layer Editor + Templates is ready for **ASTRA planning only**; SOL implementation remains blocked until W11-05 planning/DoR passes.</w:t>
+        <w:t>Dependency unlock: W11-05 planning/DoR PASS; SOL T11-W05-01 may begin only after the planning pack is merged.</w:t>
+      </w:r>
+    </w:p>
+    <w:p>
+      <w:pPr>
+        <w:pStyle w:val="Heading2"/>
+      </w:pPr>
+      <w:r>
+        <w:t>W11-05 planning checkpoint</w:t>
+      </w:r>
+    </w:p>
+    <w:p>
+      <w:pPr>
+        <w:pStyle w:val="ListBullet"/>
+      </w:pPr>
+      <w:r>
+        <w:t>Baseline: `main@8f145a6684177286f8bae3bb9c50515d6f5703b7`.</w:t>
+      </w:r>
+    </w:p>
+    <w:p>
+      <w:pPr>
+        <w:pStyle w:val="ListBullet"/>
+      </w:pPr>
+      <w:r>
+        <w:t>Dependencies: W11-04 COMPLETE / PASS; FTR-013 verified; frozen UI pack already contains required Layer/Template states.</w:t>
+      </w:r>
+    </w:p>
+    <w:p>
+      <w:pPr>
+        <w:pStyle w:val="ListBullet"/>
+      </w:pPr>
+      <w:r>
+        <w:t>Features: FTR-007 + FTR-011; FTR-013/FTR-018 cross-cut.</w:t>
+      </w:r>
+    </w:p>
+    <w:p>
+      <w:pPr>
+        <w:pStyle w:val="ListBullet"/>
+      </w:pPr>
+      <w:r>
+        <w:t>Planning/DoR: COMPLETE / PASS.</w:t>
+      </w:r>
+    </w:p>
+    <w:p>
+      <w:pPr>
+        <w:pStyle w:val="ListBullet"/>
+      </w:pPr>
+      <w:r>
+        <w:t>Acceptance: AC-W11-05-01..25.</w:t>
+      </w:r>
+    </w:p>
+    <w:p>
+      <w:pPr>
+        <w:pStyle w:val="ListBullet"/>
+      </w:pPr>
+      <w:r>
+        <w:t>Serial order: T11-W05-01 READY_AFTER_PLANNING_MERGE -&gt; T11-W05-02 BLOCKED -&gt; T11-W05-03 BLOCKED -&gt; T11-W05-04 BLOCKED -&gt; T11-W05-05 BLOCKED -&gt; T11-W05-06 BLOCKED -&gt; T11-W05-07 BLOCKED.</w:t>
+      </w:r>
+    </w:p>
+    <w:p>
+      <w:pPr>
+        <w:pStyle w:val="ListBullet"/>
+      </w:pPr>
+      <w:r>
+        <w:t>Scene/layer state is additive schema-v1, stable-ID, canonical-array-order and CommandEngine-owned.</w:t>
+      </w:r>
+    </w:p>
+    <w:p>
+      <w:pPr>
+        <w:pStyle w:val="ListBullet"/>
+      </w:pPr>
+      <w:r>
+        <w:t>Templates are local visual configuration only; Try is session-only and Apply is one template-origin atomic history unit.</w:t>
+      </w:r>
+    </w:p>
+    <w:p>
+      <w:pPr>
+        <w:pStyle w:val="ListBullet"/>
+      </w:pPr>
+      <w:r>
+        <w:t>Frozen SCR-002C/SCR-003A/SCR-003B/DLG-008 are sufficient; no new UI prompt/image generation.</w:t>
+      </w:r>
+    </w:p>
+    <w:p>
+      <w:pPr>
+        <w:pStyle w:val="ListBullet"/>
+      </w:pPr>
+      <w:r>
+        <w:t>Playback/audio-reactive remains W11-06; animation/transitions W11-07; provider/FFmpeg STEP 12.</w:t>
+      </w:r>
+    </w:p>
+    <w:p>
+      <w:pPr>
+        <w:pStyle w:val="ListBullet"/>
+      </w:pPr>
+      <w:r>
+        <w:t>W11-06 remains blocked until W11-05 reaches COMPLETE / PASS.</w:t>
       </w:r>
     </w:p>
     <w:sectPr>

</xml_diff>